<commit_message>
feat: definitive ultra-premium strategic suite and UI perfection
- Upgraded all 6 digital products to "Ultra-Premium" grade in both DOCX and Markdown formats, featuring detailed implementation guides and action checklists.
- Fixed mobile menu scrolling and layering issues by moving overflow logic to the overlay and setting z-index to 9999.
- Perfected mobile menu light theme with glassmorphism featured asset card and staggered animations.
- Restored global golden-ratio spacing utilities while providing surgical density overrides for the hero section.
- Cleaned up header.php to ensure valid HTML markup and correct stacking contexts.
- Expanded the homepage and shop sections to feature all 6 premium strategic assets with direct download links.

Co-authored-by: rossdalangin <5653086+rossdalangin@users.noreply.github.com>
</commit_message>
<xml_diff>
--- a/layunin-theme/downloadables/4_THE_ELITE_MINDSET_MATRIX.docx
+++ b/layunin-theme/downloadables/4_THE_ELITE_MINDSET_MATRIX.docx
@@ -26,7 +26,7 @@
           <w:color w:val="C5A02B"/>
           <w:sz w:val="36"/>
         </w:rPr>
-        <w:t>Decision-Making Mastery for High-Achievers</w:t>
+        <w:t>Psychological Fortitude and Decision-Making Mastery</w:t>
       </w:r>
     </w:p>
     <w:p>
@@ -52,7 +52,7 @@
         <w:pStyle w:val="Heading2"/>
       </w:pPr>
       <w:r>
-        <w:t>Radical Responsibility</w:t>
+        <w:t>I. SYSTEMS OVER MOTIVATION</w:t>
       </w:r>
     </w:p>
     <w:p>
@@ -60,7 +60,7 @@
         <w:jc w:val="left"/>
       </w:pPr>
       <w:r>
-        <w:t>Own your outcomes entirely. Eliminate the victim narrative and adopt the Internal Locus of Control for absolute agency.</w:t>
+        <w:t>Motivation is an unreliable chemical state. Systems are permanent architectural structures. The Master Architect relies on rituals of reflection and rules of decision to maintain absolute velocity regardless of mood.</w:t>
       </w:r>
     </w:p>
     <w:p>
@@ -73,7 +73,7 @@
         <w:pStyle w:val="Heading2"/>
       </w:pPr>
       <w:r>
-        <w:t>Stoic Filter for Chaos</w:t>
+        <w:t>II. RADICAL RESPONSIBILITY</w:t>
       </w:r>
     </w:p>
     <w:p>
@@ -81,7 +81,10 @@
         <w:jc w:val="left"/>
       </w:pPr>
       <w:r>
-        <w:t>Ancient techniques for absolute calm during market volatility and pressure. Practical use of the 'View from Above' and 'Pre-meditation of Evils'.</w:t>
+        <w:t xml:space="preserve">If it is in your world, it is your responsibility. Eliminate the 'Victim Narrative'. </w:t>
+        <w:br/>
+        <w:br/>
+        <w:t>The Architect's Pivot: Move from 'This happened to me' to 'I failed to architect a system that prevented this, or I failed to architect a response that solves it.' Responsibility is Power.</w:t>
       </w:r>
     </w:p>
     <w:p>
@@ -94,7 +97,7 @@
         <w:pStyle w:val="Heading2"/>
       </w:pPr>
       <w:r>
-        <w:t>Pareto Decision Making</w:t>
+        <w:t>III. THE STOIC FILTER FOR MODERN CHAOS</w:t>
       </w:r>
     </w:p>
     <w:p>
@@ -102,7 +105,10 @@
         <w:jc w:val="left"/>
       </w:pPr>
       <w:r>
-        <w:t>Identify the 2 mental models driving 80% of your progress. Use our Diagnostic Matrix to make complex choices with Tier-1 speed.</w:t>
+        <w:t xml:space="preserve">Learn ancient techniques for absolute calm during market volatility and high-pressure negotiations. </w:t>
+        <w:br/>
+        <w:br/>
+        <w:t>Pre-meditation of Evils: Visualize failure before it happens and architect the solutions in advance. Achieve an state of 'Antifragile' growth where stress makes you stronger.</w:t>
       </w:r>
     </w:p>
     <w:p>
@@ -115,7 +121,7 @@
         <w:pStyle w:val="Heading2"/>
       </w:pPr>
       <w:r>
-        <w:t>Neuroscience-Backed Flow</w:t>
+        <w:t>IV. PARETO DECISION MAKING (80/20 THINKING)</w:t>
       </w:r>
     </w:p>
     <w:p>
@@ -123,7 +129,7 @@
         <w:jc w:val="left"/>
       </w:pPr>
       <w:r>
-        <w:t xml:space="preserve"> rituals for total immersion and peak output. Architect your schedule to capitalize on biological energy peaks.</w:t>
+        <w:t>Most decisions are noise. Learn to identify the 2 mental models that drive 80% of your progress. Stop overthinking and start deciding with precision using our 'Diagnostic Matrix' for complex choices.</w:t>
       </w:r>
     </w:p>
     <w:p>
@@ -136,7 +142,7 @@
         <w:pStyle w:val="Heading2"/>
       </w:pPr>
       <w:r>
-        <w:t>Cognitive Reframing Protocol</w:t>
+        <w:t>V. THE FLOW STATE PROTOCOL</w:t>
       </w:r>
     </w:p>
     <w:p>
@@ -144,7 +150,28 @@
         <w:jc w:val="left"/>
       </w:pPr>
       <w:r>
-        <w:t>Turn failures into 'System Audits'. Master the language patterns of elite performers to ensure perpetual growth.</w:t>
+        <w:t>The neuroscience of total immersion. Flow is not an accident; it is an architectural outcome. We detail the '4 Pillars of Flow' and how to design your morning ritual to trigger a state of peak cognitive output automatically.</w:t>
+      </w:r>
+    </w:p>
+    <w:p>
+      <w:r>
+        <w:br/>
+      </w:r>
+    </w:p>
+    <w:p>
+      <w:pPr>
+        <w:pStyle w:val="Heading2"/>
+      </w:pPr>
+      <w:r>
+        <w:t>VI. COGNITIVE REFRAMING</w:t>
+      </w:r>
+    </w:p>
+    <w:p>
+      <w:pPr>
+        <w:jc w:val="left"/>
+      </w:pPr>
+      <w:r>
+        <w:t>How to turn every setback into a 'System Audit'. Master the internal language patterns used by the top 0.1% to maintain momentum. Move from 'I have to' to 'I get to'.</w:t>
       </w:r>
     </w:p>
     <w:p>
@@ -165,7 +192,7 @@
         <w:pStyle w:val="ListBullet"/>
       </w:pPr>
       <w:r>
-        <w:t>Identify the 'Victim Narrative' currently holding back one area of your life.</w:t>
+        <w:t>Perform a 'Victim Narrative' audit on one current life challenge.</w:t>
       </w:r>
     </w:p>
     <w:p>
@@ -173,7 +200,7 @@
         <w:pStyle w:val="ListBullet"/>
       </w:pPr>
       <w:r>
-        <w:t>Map your Peak Biological Energy windows for the next week.</w:t>
+        <w:t>Map your Daily Peak Energy windows for the next 7 days.</w:t>
       </w:r>
     </w:p>
     <w:p>
@@ -181,7 +208,7 @@
         <w:pStyle w:val="ListBullet"/>
       </w:pPr>
       <w:r>
-        <w:t>Implement a 'Digital Sunset' ritual to protect your cognitive recovery.</w:t>
+        <w:t>Implement a 'Digital Sunset' ritual to protect cognitive recovery.</w:t>
       </w:r>
     </w:p>
     <w:p>
@@ -197,7 +224,7 @@
         <w:pStyle w:val="ListBullet"/>
       </w:pPr>
       <w:r>
-        <w:t>Schedule one 4-hour Deep Work block for your Keystone Goal.</w:t>
+        <w:t>Commit to 4 hours of 'Uninterrupted Architecture' this week.</w:t>
       </w:r>
     </w:p>
     <w:p>

</xml_diff>